<commit_message>
Fix: include splash_image and banner_image in logo setup (splash screen branding was missing)
</commit_message>
<xml_diff>
--- a/docs/Handbook_Instalasi_ERPNext_v15_Multi_Bench.docx
+++ b/docs/Handbook_Instalasi_ERPNext_v15_Multi_Bench.docx
@@ -4272,6 +4272,32 @@
                 <w:szCs w:val="19"/>
               </w:rPr>
               <w:t xml:space="preserve">&gt;&gt;&gt; ws.brand_html = "&lt;img src='/files/lobar.png' style='max-width: 100px;'&gt;"</w:t>
+            </w:r>
+          </w:p>
+          <w:p>
+            <w:pPr>
+              <w:spacing w:after="0"/>
+            </w:pPr>
+            <w:r>
+              <w:rPr>
+                <w:rFonts w:ascii="Consolas" w:cs="Consolas" w:eastAsia="Consolas" w:hAnsi="Consolas"/>
+                <w:sz w:val="19"/>
+                <w:szCs w:val="19"/>
+              </w:rPr>
+              <w:t xml:space="preserve">&gt;&gt;&gt; ws.splash_image = "/files/hpy2.png"     # splash/loading screen -- mudah terlewat!</w:t>
+            </w:r>
+          </w:p>
+          <w:p>
+            <w:pPr>
+              <w:spacing w:after="0"/>
+            </w:pPr>
+            <w:r>
+              <w:rPr>
+                <w:rFonts w:ascii="Consolas" w:cs="Consolas" w:eastAsia="Consolas" w:hAnsi="Consolas"/>
+                <w:sz w:val="19"/>
+                <w:szCs w:val="19"/>
+              </w:rPr>
+              <w:t xml:space="preserve">&gt;&gt;&gt; ws.banner_image = "/files/lobar.png"</w:t>
             </w:r>
           </w:p>
           <w:p>

</xml_diff>

<commit_message>
Fix: remove client-specific TitanBaking logo (lobar.png), use generic hpy2.png as default everywhere
</commit_message>
<xml_diff>
--- a/docs/Handbook_Instalasi_ERPNext_v15_Multi_Bench.docx
+++ b/docs/Handbook_Instalasi_ERPNext_v15_Multi_Bench.docx
@@ -4072,7 +4072,7 @@
         <w:tc>
           <w:tcPr>
             <w:tcW w:type="dxa" w:w="9350"/>
-            <w:shd w:fill="F2F2F2" w:color="auto" w:val="clear"/>
+            <w:shd w:fill="FDE8E8" w:color="auto" w:val="clear"/>
             <w:tcMar>
               <w:top w:type="dxa" w:w="120"/>
               <w:left w:type="dxa" w:w="150"/>
@@ -4082,41 +4082,33 @@
           </w:tcPr>
           <w:p>
             <w:pPr>
-              <w:spacing w:after="0"/>
-            </w:pPr>
-            <w:r>
-              <w:rPr>
-                <w:rFonts w:ascii="Consolas" w:cs="Consolas" w:eastAsia="Consolas" w:hAnsi="Consolas"/>
-                <w:sz w:val="19"/>
-                <w:szCs w:val="19"/>
-              </w:rPr>
-              <w:t xml:space="preserve">cp hpy2.png lobar.png sites/&lt;nama-site&gt;/public/files/</w:t>
-            </w:r>
-          </w:p>
-          <w:p>
-            <w:pPr>
-              <w:spacing w:after="0"/>
-            </w:pPr>
-            <w:r>
-              <w:rPr>
-                <w:rFonts w:ascii="Consolas" w:cs="Consolas" w:eastAsia="Consolas" w:hAnsi="Consolas"/>
-                <w:sz w:val="19"/>
-                <w:szCs w:val="19"/>
-              </w:rPr>
-              <w:t xml:space="preserve">chown frappe:frappe sites/&lt;nama-site&gt;/public/files/hpy2.png sites/&lt;nama-site&gt;/public/files/lobar.png</w:t>
+              <w:spacing w:after="40"/>
+            </w:pPr>
+            <w:r>
+              <w:rPr>
+                <w:b/>
+                <w:bCs/>
+                <w:sz w:val="20"/>
+                <w:szCs w:val="20"/>
+              </w:rPr>
+              <w:t xml:space="preserve">Jangan tertukar aset logo</w:t>
+            </w:r>
+          </w:p>
+          <w:p>
+            <w:pPr>
+              <w:spacing w:after="0"/>
+            </w:pPr>
+            <w:r>
+              <w:rPr>
+                <w:sz w:val="20"/>
+                <w:szCs w:val="20"/>
+              </w:rPr>
+              <w:t xml:space="preserve">Pastikan file logo yang dipakai sebagai default memang logo generik HPY (hpy2.png), BUKAN logo milik klien tertentu. Saat instalasi ini, sempat salah pakai 'lobar.png' yang ternyata logo client 'TitanBaking', bukan aset HPY generik -- sudah diperbaiki, dan lobar.png dihapus dari repo app. Logo milik klien spesifik hanya boleh dipasang di site milik klien itu, tidak dijadikan default di app/repo bersama.</w:t>
             </w:r>
           </w:p>
         </w:tc>
       </w:tr>
     </w:tbl>
-    <w:p>
-      <w:pPr>
-        <w:spacing w:after="160"/>
-      </w:pPr>
-      <w:r>
-        <w:t xml:space="preserve">Lalu daftarkan sebagai File record dan arahkan Website Settings, lewat bench console:</w:t>
-      </w:r>
-    </w:p>
     <w:tbl>
       <w:tblPr>
         <w:tblW w:type="dxa" w:w="9350"/>
@@ -4154,6 +4146,70 @@
                 <w:sz w:val="19"/>
                 <w:szCs w:val="19"/>
               </w:rPr>
+              <w:t xml:space="preserve">cp hpy2.png sites/&lt;nama-site&gt;/public/files/</w:t>
+            </w:r>
+          </w:p>
+          <w:p>
+            <w:pPr>
+              <w:spacing w:after="0"/>
+            </w:pPr>
+            <w:r>
+              <w:rPr>
+                <w:rFonts w:ascii="Consolas" w:cs="Consolas" w:eastAsia="Consolas" w:hAnsi="Consolas"/>
+                <w:sz w:val="19"/>
+                <w:szCs w:val="19"/>
+              </w:rPr>
+              <w:t xml:space="preserve">chown frappe:frappe sites/&lt;nama-site&gt;/public/files/hpy2.png</w:t>
+            </w:r>
+          </w:p>
+        </w:tc>
+      </w:tr>
+    </w:tbl>
+    <w:p>
+      <w:pPr>
+        <w:spacing w:after="160"/>
+      </w:pPr>
+      <w:r>
+        <w:t xml:space="preserve">Lalu daftarkan sebagai File record dan arahkan Website Settings (ada 4 field, semua pakai logo generik yang sama), lewat bench console:</w:t>
+      </w:r>
+    </w:p>
+    <w:tbl>
+      <w:tblPr>
+        <w:tblW w:type="dxa" w:w="9350"/>
+        <w:tblBorders>
+          <w:top w:val="single" w:color="CCCCCC" w:sz="4"/>
+          <w:left w:val="single" w:color="CCCCCC" w:sz="4"/>
+          <w:bottom w:val="single" w:color="CCCCCC" w:sz="4"/>
+          <w:right w:val="single" w:color="CCCCCC" w:sz="4"/>
+          <w:insideH w:val="none" w:color="FFFFFF" w:sz="0"/>
+          <w:insideV w:val="none" w:color="FFFFFF" w:sz="0"/>
+        </w:tblBorders>
+      </w:tblPr>
+      <w:tblGrid>
+        <w:gridCol w:w="9350"/>
+      </w:tblGrid>
+      <w:tr>
+        <w:tc>
+          <w:tcPr>
+            <w:tcW w:type="dxa" w:w="9350"/>
+            <w:shd w:fill="F2F2F2" w:color="auto" w:val="clear"/>
+            <w:tcMar>
+              <w:top w:type="dxa" w:w="120"/>
+              <w:left w:type="dxa" w:w="150"/>
+              <w:bottom w:type="dxa" w:w="120"/>
+              <w:right w:type="dxa" w:w="150"/>
+            </w:tcMar>
+          </w:tcPr>
+          <w:p>
+            <w:pPr>
+              <w:spacing w:after="0"/>
+            </w:pPr>
+            <w:r>
+              <w:rPr>
+                <w:rFonts w:ascii="Consolas" w:cs="Consolas" w:eastAsia="Consolas" w:hAnsi="Consolas"/>
+                <w:sz w:val="19"/>
+                <w:szCs w:val="19"/>
+              </w:rPr>
               <w:t xml:space="preserve">bench --site &lt;nama-site&gt; console</w:t>
             </w:r>
           </w:p>
@@ -4193,46 +4249,33 @@
                 <w:sz w:val="19"/>
                 <w:szCs w:val="19"/>
               </w:rPr>
-              <w:t xml:space="preserve">&gt;&gt;&gt; for fname, path in [("hpy2.png", "/files/hpy2.png"), ("lobar.png", "/files/lobar.png")]:</w:t>
-            </w:r>
-          </w:p>
-          <w:p>
-            <w:pPr>
-              <w:spacing w:after="0"/>
-            </w:pPr>
-            <w:r>
-              <w:rPr>
-                <w:rFonts w:ascii="Consolas" w:cs="Consolas" w:eastAsia="Consolas" w:hAnsi="Consolas"/>
-                <w:sz w:val="19"/>
-                <w:szCs w:val="19"/>
-              </w:rPr>
-              <w:t xml:space="preserve">...     if not frappe.db.exists("File", {"file_url": path}):</w:t>
-            </w:r>
-          </w:p>
-          <w:p>
-            <w:pPr>
-              <w:spacing w:after="0"/>
-            </w:pPr>
-            <w:r>
-              <w:rPr>
-                <w:rFonts w:ascii="Consolas" w:cs="Consolas" w:eastAsia="Consolas" w:hAnsi="Consolas"/>
-                <w:sz w:val="19"/>
-                <w:szCs w:val="19"/>
-              </w:rPr>
-              <w:t xml:space="preserve">...         frappe.get_doc({"doctype": "File", "file_name": fname,</w:t>
-            </w:r>
-          </w:p>
-          <w:p>
-            <w:pPr>
-              <w:spacing w:after="0"/>
-            </w:pPr>
-            <w:r>
-              <w:rPr>
-                <w:rFonts w:ascii="Consolas" w:cs="Consolas" w:eastAsia="Consolas" w:hAnsi="Consolas"/>
-                <w:sz w:val="19"/>
-                <w:szCs w:val="19"/>
-              </w:rPr>
-              <w:t xml:space="preserve">...             "file_url": path, "is_private": 0}).insert(ignore_permissions=True)</w:t>
+              <w:t xml:space="preserve">&gt;&gt;&gt; if not frappe.db.exists("File", {"file_url": "/files/hpy2.png"}):</w:t>
+            </w:r>
+          </w:p>
+          <w:p>
+            <w:pPr>
+              <w:spacing w:after="0"/>
+            </w:pPr>
+            <w:r>
+              <w:rPr>
+                <w:rFonts w:ascii="Consolas" w:cs="Consolas" w:eastAsia="Consolas" w:hAnsi="Consolas"/>
+                <w:sz w:val="19"/>
+                <w:szCs w:val="19"/>
+              </w:rPr>
+              <w:t xml:space="preserve">...     frappe.get_doc({"doctype": "File", "file_name": "hpy2.png",</w:t>
+            </w:r>
+          </w:p>
+          <w:p>
+            <w:pPr>
+              <w:spacing w:after="0"/>
+            </w:pPr>
+            <w:r>
+              <w:rPr>
+                <w:rFonts w:ascii="Consolas" w:cs="Consolas" w:eastAsia="Consolas" w:hAnsi="Consolas"/>
+                <w:sz w:val="19"/>
+                <w:szCs w:val="19"/>
+              </w:rPr>
+              <w:t xml:space="preserve">...         "file_url": "/files/hpy2.png", "is_private": 0}).insert(ignore_permissions=True)</w:t>
             </w:r>
           </w:p>
           <w:p>
@@ -4271,7 +4314,7 @@
                 <w:sz w:val="19"/>
                 <w:szCs w:val="19"/>
               </w:rPr>
-              <w:t xml:space="preserve">&gt;&gt;&gt; ws.brand_html = "&lt;img src='/files/lobar.png' style='max-width: 100px;'&gt;"</w:t>
+              <w:t xml:space="preserve">&gt;&gt;&gt; ws.brand_html = "&lt;img src='/files/hpy2.png' style='max-width: 100px;'&gt;"</w:t>
             </w:r>
           </w:p>
           <w:p>
@@ -4297,7 +4340,7 @@
                 <w:sz w:val="19"/>
                 <w:szCs w:val="19"/>
               </w:rPr>
-              <w:t xml:space="preserve">&gt;&gt;&gt; ws.banner_image = "/files/lobar.png"</w:t>
+              <w:t xml:space="preserve">&gt;&gt;&gt; ws.banner_image = "/files/hpy2.png"</w:t>
             </w:r>
           </w:p>
           <w:p>

</xml_diff>